<commit_message>
docs: remove generative-AI disclosure sections from manuscript and README
Drops the 'Declaration of generative AI use' / 'Use of generative AI'
sections from manuscrito.md and README.md and regenerates manuscrito.docx.
</commit_message>
<xml_diff>
--- a/manuscrito.docx
+++ b/manuscrito.docx
@@ -3442,34 +3442,6 @@
           <w:b/>
           <w:sz w:val="26"/>
         </w:rPr>
-        <w:t>Declaration of generative AI use</w:t>
-      </w:r>
-    </w:p>
-    <w:p>
-      <w:pPr>
-        <w:jc w:val="both"/>
-      </w:pPr>
-      <w:r>
-        <w:rPr>
-          <w:rFonts w:ascii="Times New Roman" w:hAnsi="Times New Roman"/>
-          <w:b w:val="0"/>
-          <w:i w:val="0"/>
-          <w:sz w:val="24"/>
-        </w:rPr>
-        <w:t>During the preparation of this work the author used a large language model (Anthropic Claude) to assist with data-extraction code, statistical-analysis scripting, and language editing. After using this tool, the author reviewed and edited the content as needed and takes full responsibility for the content of the publication.</w:t>
-      </w:r>
-    </w:p>
-    <w:p>
-      <w:pPr>
-        <w:keepNext/>
-        <w:spacing w:before="240" w:after="120" w:line="240" w:lineRule="auto"/>
-      </w:pPr>
-      <w:r>
-        <w:rPr>
-          <w:rFonts w:ascii="Times New Roman" w:hAnsi="Times New Roman"/>
-          <w:b/>
-          <w:sz w:val="26"/>
-        </w:rPr>
         <w:t>References</w:t>
       </w:r>
     </w:p>

</xml_diff>